<commit_message>
Add Project 07 - Wishlist App - Use and set up for Room database - Entity and DAO - Repositories and Coroutines - Use of Navigation and Swipe to delete items
</commit_message>
<xml_diff>
--- a/Documentation/The Complete Android 14 and Kotlin Development Masterclass.docx
+++ b/Documentation/The Complete Android 14 and Kotlin Development Masterclass.docx
@@ -28395,91 +28395,78 @@
         </w:rPr>
       </w:pPr>
       <w:r>
-        <w:rPr>
-          <w:lang w:val="en-US"/>
-        </w:rPr>
-      </w:r>
-    </w:p>
-    <w:p>
-      <w:pPr>
-        <w:pStyle w:val="Heading2"/>
-        <w:rPr>
-          <w:lang w:val="en-US"/>
-        </w:rPr>
-      </w:pPr>
-      <w:r>
-        <w:rPr>
-          <w:lang w:val="en-US"/>
-        </w:rPr>
-        <w:t>Checking access to location permission</w:t>
-      </w:r>
-    </w:p>
-    <w:p>
-      <w:pPr>
-        <w:pStyle w:val="Normal"/>
-        <w:jc w:val="both"/>
-        <w:rPr>
-          <w:lang w:val="en-US"/>
-        </w:rPr>
-      </w:pPr>
-      <w:r>
-        <w:rPr>
-          <w:lang w:val="en-US"/>
-        </w:rPr>
-      </w:r>
-    </w:p>
-    <w:p>
-      <w:pPr>
-        <w:pStyle w:val="Normal"/>
-        <w:jc w:val="both"/>
-        <w:rPr>
-          <w:lang w:val="en-US"/>
-        </w:rPr>
-      </w:pPr>
-      <w:r>
-        <w:rPr>
-          <w:lang w:val="en-US"/>
-        </w:rPr>
-      </w:r>
-    </w:p>
-    <w:p>
-      <w:pPr>
-        <w:pStyle w:val="Normal"/>
-        <w:jc w:val="both"/>
-        <w:rPr>
-          <w:lang w:val="en-US"/>
-        </w:rPr>
-      </w:pPr>
-      <w:r>
-        <w:rPr>
-          <w:lang w:val="en-US"/>
-        </w:rPr>
-      </w:r>
-    </w:p>
-    <w:p>
-      <w:pPr>
-        <w:pStyle w:val="Normal"/>
-        <w:jc w:val="both"/>
-        <w:rPr>
-          <w:lang w:val="en-US"/>
-        </w:rPr>
-      </w:pPr>
-      <w:r>
-        <w:rPr>
-          <w:lang w:val="en-US"/>
-        </w:rPr>
-      </w:r>
-    </w:p>
-    <w:p>
-      <w:pPr>
-        <w:pStyle w:val="Normal"/>
-        <w:jc w:val="both"/>
-        <w:rPr>
-          <w:lang w:val="en-US"/>
-        </w:rPr>
-      </w:pPr>
-      <w:r>
-        <w:rPr/>
+        <w:rPr/>
+      </w:r>
+    </w:p>
+    <w:p>
+      <w:pPr>
+        <w:pStyle w:val="Normal"/>
+        <w:jc w:val="both"/>
+        <w:rPr>
+          <w:lang w:val="en-US"/>
+        </w:rPr>
+      </w:pPr>
+      <w:r>
+        <w:rPr>
+          <w:lang w:val="en-US"/>
+        </w:rPr>
+      </w:r>
+    </w:p>
+    <w:p>
+      <w:pPr>
+        <w:pStyle w:val="Normal"/>
+        <w:jc w:val="both"/>
+        <w:rPr>
+          <w:lang w:val="en-US"/>
+        </w:rPr>
+      </w:pPr>
+      <w:r>
+        <w:rPr>
+          <w:lang w:val="en-US"/>
+        </w:rPr>
+        <w:t>Mastering Integration: API Calls, JSON P</w:t>
+      </w:r>
+    </w:p>
+    <w:p>
+      <w:pPr>
+        <w:pStyle w:val="Normal"/>
+        <w:jc w:val="both"/>
+        <w:rPr>
+          <w:lang w:val="en-US"/>
+        </w:rPr>
+      </w:pPr>
+      <w:r>
+        <w:rPr>
+          <w:lang w:val="en-US"/>
+        </w:rPr>
+      </w:r>
+    </w:p>
+    <w:p>
+      <w:pPr>
+        <w:pStyle w:val="Normal"/>
+        <w:jc w:val="both"/>
+        <w:rPr>
+          <w:lang w:val="en-US"/>
+        </w:rPr>
+      </w:pPr>
+      <w:r>
+        <w:rPr>
+          <w:lang w:val="en-US"/>
+        </w:rPr>
+      </w:r>
+    </w:p>
+    <w:p>
+      <w:pPr>
+        <w:pStyle w:val="Normal"/>
+        <w:jc w:val="both"/>
+        <w:rPr>
+          <w:lang w:val="en-US"/>
+        </w:rPr>
+      </w:pPr>
+      <w:r>
+        <w:rPr>
+          <w:lang w:val="en-US"/>
+        </w:rPr>
       </w:r>
     </w:p>
     <w:sectPr>
@@ -28510,7 +28497,6 @@
       </w:pPr>
       <w:rPr>
         <w:rFonts w:ascii="Aptos" w:hAnsi="Aptos" w:cs="Aptos" w:hint="default"/>
-        <w:rFonts w:cstheme="minorBidi" w:eastAsiaTheme="minorHAnsi"/>
       </w:rPr>
     </w:lvl>
     <w:lvl w:ilvl="1">
@@ -28647,7 +28633,6 @@
       </w:pPr>
       <w:rPr>
         <w:rFonts w:ascii="Symbol" w:hAnsi="Symbol" w:cs="Symbol" w:hint="default"/>
-        <w:rFonts w:cstheme="minorBidi" w:eastAsiaTheme="minorHAnsi"/>
       </w:rPr>
     </w:lvl>
     <w:lvl w:ilvl="1">
@@ -29420,6 +29405,7 @@
     <w:qFormat/>
     <w:pPr>
       <w:widowControl/>
+      <w:suppressAutoHyphens w:val="true"/>
       <w:bidi w:val="0"/>
       <w:spacing w:before="0" w:after="0"/>
       <w:jc w:val="left"/>
@@ -29448,7 +29434,7 @@
       <w:outlineLvl w:val="0"/>
     </w:pPr>
     <w:rPr>
-      <w:rFonts w:ascii="Aptos Display" w:hAnsi="Aptos Display" w:eastAsia="等线 Light" w:cs="" w:asciiTheme="majorHAnsi" w:cstheme="majorBidi" w:eastAsiaTheme="majorEastAsia" w:hAnsiTheme="majorHAnsi"/>
+      <w:rFonts w:ascii="Aptos Display" w:hAnsi="Aptos Display" w:eastAsia="" w:cs="" w:asciiTheme="majorHAnsi" w:cstheme="majorBidi" w:eastAsiaTheme="majorEastAsia" w:hAnsiTheme="majorHAnsi"/>
       <w:color w:themeColor="accent1" w:themeShade="bf" w:val="104862"/>
       <w:sz w:val="40"/>
       <w:szCs w:val="40"/>
@@ -29469,7 +29455,7 @@
       <w:outlineLvl w:val="1"/>
     </w:pPr>
     <w:rPr>
-      <w:rFonts w:ascii="Aptos Display" w:hAnsi="Aptos Display" w:eastAsia="等线 Light" w:cs="" w:asciiTheme="majorHAnsi" w:cstheme="majorBidi" w:eastAsiaTheme="majorEastAsia" w:hAnsiTheme="majorHAnsi"/>
+      <w:rFonts w:ascii="Aptos Display" w:hAnsi="Aptos Display" w:eastAsia="" w:cs="" w:asciiTheme="majorHAnsi" w:cstheme="majorBidi" w:eastAsiaTheme="majorEastAsia" w:hAnsiTheme="majorHAnsi"/>
       <w:color w:themeColor="accent1" w:themeShade="bf" w:val="104862"/>
       <w:sz w:val="32"/>
       <w:szCs w:val="32"/>
@@ -29490,7 +29476,7 @@
       <w:outlineLvl w:val="2"/>
     </w:pPr>
     <w:rPr>
-      <w:rFonts w:eastAsia="等线 Light" w:cs="" w:cstheme="majorBidi" w:eastAsiaTheme="majorEastAsia"/>
+      <w:rFonts w:eastAsia="" w:cs="" w:cstheme="majorBidi" w:eastAsiaTheme="majorEastAsia"/>
       <w:color w:themeColor="accent1" w:themeShade="bf" w:val="104862"/>
       <w:sz w:val="28"/>
       <w:szCs w:val="28"/>
@@ -29512,7 +29498,7 @@
       <w:outlineLvl w:val="3"/>
     </w:pPr>
     <w:rPr>
-      <w:rFonts w:eastAsia="等线 Light" w:cs="" w:cstheme="majorBidi" w:eastAsiaTheme="majorEastAsia"/>
+      <w:rFonts w:eastAsia="" w:cs="" w:cstheme="majorBidi" w:eastAsiaTheme="majorEastAsia"/>
       <w:i/>
       <w:iCs/>
       <w:color w:themeColor="accent1" w:themeShade="bf" w:val="104862"/>
@@ -29534,7 +29520,7 @@
       <w:outlineLvl w:val="4"/>
     </w:pPr>
     <w:rPr>
-      <w:rFonts w:eastAsia="等线 Light" w:cs="" w:cstheme="majorBidi" w:eastAsiaTheme="majorEastAsia"/>
+      <w:rFonts w:eastAsia="" w:cs="" w:cstheme="majorBidi" w:eastAsiaTheme="majorEastAsia"/>
       <w:color w:themeColor="accent1" w:themeShade="bf" w:val="104862"/>
     </w:rPr>
   </w:style>
@@ -29554,16 +29540,16 @@
       <w:outlineLvl w:val="5"/>
     </w:pPr>
     <w:rPr>
-      <w:rFonts w:eastAsia="等线 Light" w:cs="" w:cstheme="majorBidi" w:eastAsiaTheme="majorEastAsia"/>
+      <w:rFonts w:eastAsia="" w:cs="" w:cstheme="majorBidi" w:eastAsiaTheme="majorEastAsia"/>
       <w:i/>
       <w:iCs/>
-      <w:color w:themeColor="dark1" w:themeTint="fe" w:val="595959"/>
+      <w:color w:val="595959"/>
       <w14:textFill>
         <w14:solidFill>
-          <w14:schemeClr w14:val="dark1">
+          <w14:srgbClr w14:val="595959">
+            <w14:lumOff w14:val="35000"/>
             <w14:lumMod w14:val="65000"/>
-            <w14:lumOff w14:val="35000"/>
-          </w14:schemeClr>
+          </w14:srgbClr>
         </w14:solidFill>
       </w14:textFill>
     </w:rPr>
@@ -29584,14 +29570,14 @@
       <w:outlineLvl w:val="6"/>
     </w:pPr>
     <w:rPr>
-      <w:rFonts w:eastAsia="等线 Light" w:cs="" w:cstheme="majorBidi" w:eastAsiaTheme="majorEastAsia"/>
-      <w:color w:themeColor="dark1" w:themeTint="fe" w:val="595959"/>
+      <w:rFonts w:eastAsia="" w:cs="" w:cstheme="majorBidi" w:eastAsiaTheme="majorEastAsia"/>
+      <w:color w:val="595959"/>
       <w14:textFill>
         <w14:solidFill>
-          <w14:schemeClr w14:val="dark1">
+          <w14:srgbClr w14:val="595959">
+            <w14:lumOff w14:val="35000"/>
             <w14:lumMod w14:val="65000"/>
-            <w14:lumOff w14:val="35000"/>
-          </w14:schemeClr>
+          </w14:srgbClr>
         </w14:solidFill>
       </w14:textFill>
     </w:rPr>
@@ -29611,16 +29597,16 @@
       <w:outlineLvl w:val="7"/>
     </w:pPr>
     <w:rPr>
-      <w:rFonts w:eastAsia="等线 Light" w:cs="" w:cstheme="majorBidi" w:eastAsiaTheme="majorEastAsia"/>
+      <w:rFonts w:eastAsia="" w:cs="" w:cstheme="majorBidi" w:eastAsiaTheme="majorEastAsia"/>
       <w:i/>
       <w:iCs/>
-      <w:color w:themeColor="dark1" w:themeTint="ff" w:val="262626"/>
+      <w:color w:val="262626"/>
       <w14:textFill>
         <w14:solidFill>
-          <w14:schemeClr w14:val="dark1">
+          <w14:srgbClr w14:val="262626">
+            <w14:lumOff w14:val="15000"/>
             <w14:lumMod w14:val="85000"/>
-            <w14:lumOff w14:val="15000"/>
-          </w14:schemeClr>
+          </w14:srgbClr>
         </w14:solidFill>
       </w14:textFill>
     </w:rPr>
@@ -29640,14 +29626,14 @@
       <w:outlineLvl w:val="8"/>
     </w:pPr>
     <w:rPr>
-      <w:rFonts w:eastAsia="等线 Light" w:cs="" w:cstheme="majorBidi" w:eastAsiaTheme="majorEastAsia"/>
-      <w:color w:themeColor="dark1" w:themeTint="ff" w:val="262626"/>
+      <w:rFonts w:eastAsia="" w:cs="" w:cstheme="majorBidi" w:eastAsiaTheme="majorEastAsia"/>
+      <w:color w:val="262626"/>
       <w14:textFill>
         <w14:solidFill>
-          <w14:schemeClr w14:val="dark1">
+          <w14:srgbClr w14:val="262626">
+            <w14:lumOff w14:val="15000"/>
             <w14:lumMod w14:val="85000"/>
-            <w14:lumOff w14:val="15000"/>
-          </w14:schemeClr>
+          </w14:srgbClr>
         </w14:solidFill>
       </w14:textFill>
     </w:rPr>
@@ -29676,7 +29662,7 @@
     <w:uiPriority w:val="9"/>
     <w:qFormat/>
     <w:rPr>
-      <w:rFonts w:ascii="Aptos Display" w:hAnsi="Aptos Display" w:eastAsia="等线 Light" w:cs="" w:asciiTheme="majorHAnsi" w:cstheme="majorBidi" w:eastAsiaTheme="majorEastAsia" w:hAnsiTheme="majorHAnsi"/>
+      <w:rFonts w:ascii="Aptos Display" w:hAnsi="Aptos Display" w:eastAsia="" w:cs="" w:asciiTheme="majorHAnsi" w:cstheme="majorBidi" w:eastAsiaTheme="majorEastAsia" w:hAnsiTheme="majorHAnsi"/>
       <w:color w:themeColor="accent1" w:themeShade="bf" w:val="104862"/>
       <w:sz w:val="40"/>
       <w:szCs w:val="40"/>
@@ -29689,7 +29675,7 @@
     <w:uiPriority w:val="9"/>
     <w:qFormat/>
     <w:rPr>
-      <w:rFonts w:ascii="Aptos Display" w:hAnsi="Aptos Display" w:eastAsia="等线 Light" w:cs="" w:asciiTheme="majorHAnsi" w:cstheme="majorBidi" w:eastAsiaTheme="majorEastAsia" w:hAnsiTheme="majorHAnsi"/>
+      <w:rFonts w:ascii="Aptos Display" w:hAnsi="Aptos Display" w:eastAsia="" w:cs="" w:asciiTheme="majorHAnsi" w:cstheme="majorBidi" w:eastAsiaTheme="majorEastAsia" w:hAnsiTheme="majorHAnsi"/>
       <w:color w:themeColor="accent1" w:themeShade="bf" w:val="104862"/>
       <w:sz w:val="32"/>
       <w:szCs w:val="32"/>
@@ -29702,7 +29688,7 @@
     <w:uiPriority w:val="9"/>
     <w:qFormat/>
     <w:rPr>
-      <w:rFonts w:eastAsia="等线 Light" w:cs="" w:cstheme="majorBidi" w:eastAsiaTheme="majorEastAsia"/>
+      <w:rFonts w:eastAsia="" w:cs="" w:cstheme="majorBidi" w:eastAsiaTheme="majorEastAsia"/>
       <w:color w:themeColor="accent1" w:themeShade="bf" w:val="104862"/>
       <w:sz w:val="28"/>
       <w:szCs w:val="28"/>
@@ -29716,7 +29702,7 @@
     <w:semiHidden/>
     <w:qFormat/>
     <w:rPr>
-      <w:rFonts w:eastAsia="等线 Light" w:cs="" w:cstheme="majorBidi" w:eastAsiaTheme="majorEastAsia"/>
+      <w:rFonts w:eastAsia="" w:cs="" w:cstheme="majorBidi" w:eastAsiaTheme="majorEastAsia"/>
       <w:i/>
       <w:iCs/>
       <w:color w:themeColor="accent1" w:themeShade="bf" w:val="104862"/>
@@ -29730,7 +29716,7 @@
     <w:semiHidden/>
     <w:qFormat/>
     <w:rPr>
-      <w:rFonts w:eastAsia="等线 Light" w:cs="" w:cstheme="majorBidi" w:eastAsiaTheme="majorEastAsia"/>
+      <w:rFonts w:eastAsia="" w:cs="" w:cstheme="majorBidi" w:eastAsiaTheme="majorEastAsia"/>
       <w:color w:themeColor="accent1" w:themeShade="bf" w:val="104862"/>
     </w:rPr>
   </w:style>
@@ -29742,16 +29728,16 @@
     <w:semiHidden/>
     <w:qFormat/>
     <w:rPr>
-      <w:rFonts w:eastAsia="等线 Light" w:cs="" w:cstheme="majorBidi" w:eastAsiaTheme="majorEastAsia"/>
+      <w:rFonts w:eastAsia="" w:cs="" w:cstheme="majorBidi" w:eastAsiaTheme="majorEastAsia"/>
       <w:i/>
       <w:iCs/>
-      <w:color w:themeColor="dark1" w:themeTint="fe" w:val="595959"/>
+      <w:color w:val="595959"/>
       <w14:textFill>
         <w14:solidFill>
-          <w14:schemeClr w14:val="dark1">
+          <w14:srgbClr w14:val="595959">
+            <w14:lumOff w14:val="35000"/>
             <w14:lumMod w14:val="65000"/>
-            <w14:lumOff w14:val="35000"/>
-          </w14:schemeClr>
+          </w14:srgbClr>
         </w14:solidFill>
       </w14:textFill>
     </w:rPr>
@@ -29764,14 +29750,14 @@
     <w:semiHidden/>
     <w:qFormat/>
     <w:rPr>
-      <w:rFonts w:eastAsia="等线 Light" w:cs="" w:cstheme="majorBidi" w:eastAsiaTheme="majorEastAsia"/>
-      <w:color w:themeColor="dark1" w:themeTint="fe" w:val="595959"/>
+      <w:rFonts w:eastAsia="" w:cs="" w:cstheme="majorBidi" w:eastAsiaTheme="majorEastAsia"/>
+      <w:color w:val="595959"/>
       <w14:textFill>
         <w14:solidFill>
-          <w14:schemeClr w14:val="dark1">
+          <w14:srgbClr w14:val="595959">
+            <w14:lumOff w14:val="35000"/>
             <w14:lumMod w14:val="65000"/>
-            <w14:lumOff w14:val="35000"/>
-          </w14:schemeClr>
+          </w14:srgbClr>
         </w14:solidFill>
       </w14:textFill>
     </w:rPr>
@@ -29784,16 +29770,16 @@
     <w:semiHidden/>
     <w:qFormat/>
     <w:rPr>
-      <w:rFonts w:eastAsia="等线 Light" w:cs="" w:cstheme="majorBidi" w:eastAsiaTheme="majorEastAsia"/>
+      <w:rFonts w:eastAsia="" w:cs="" w:cstheme="majorBidi" w:eastAsiaTheme="majorEastAsia"/>
       <w:i/>
       <w:iCs/>
-      <w:color w:themeColor="dark1" w:themeTint="ff" w:val="262626"/>
+      <w:color w:val="262626"/>
       <w14:textFill>
         <w14:solidFill>
-          <w14:schemeClr w14:val="dark1">
+          <w14:srgbClr w14:val="262626">
+            <w14:lumOff w14:val="15000"/>
             <w14:lumMod w14:val="85000"/>
-            <w14:lumOff w14:val="15000"/>
-          </w14:schemeClr>
+          </w14:srgbClr>
         </w14:solidFill>
       </w14:textFill>
     </w:rPr>
@@ -29806,14 +29792,14 @@
     <w:semiHidden/>
     <w:qFormat/>
     <w:rPr>
-      <w:rFonts w:eastAsia="等线 Light" w:cs="" w:cstheme="majorBidi" w:eastAsiaTheme="majorEastAsia"/>
-      <w:color w:themeColor="dark1" w:themeTint="ff" w:val="262626"/>
+      <w:rFonts w:eastAsia="" w:cs="" w:cstheme="majorBidi" w:eastAsiaTheme="majorEastAsia"/>
+      <w:color w:val="262626"/>
       <w14:textFill>
         <w14:solidFill>
-          <w14:schemeClr w14:val="dark1">
+          <w14:srgbClr w14:val="262626">
+            <w14:lumOff w14:val="15000"/>
             <w14:lumMod w14:val="85000"/>
-            <w14:lumOff w14:val="15000"/>
-          </w14:schemeClr>
+          </w14:srgbClr>
         </w14:solidFill>
       </w14:textFill>
     </w:rPr>
@@ -29825,7 +29811,7 @@
     <w:uiPriority w:val="10"/>
     <w:qFormat/>
     <w:rPr>
-      <w:rFonts w:ascii="Aptos Display" w:hAnsi="Aptos Display" w:eastAsia="等线 Light" w:cs="" w:asciiTheme="majorHAnsi" w:cstheme="majorBidi" w:eastAsiaTheme="majorEastAsia" w:hAnsiTheme="majorHAnsi"/>
+      <w:rFonts w:ascii="Aptos Display" w:hAnsi="Aptos Display" w:eastAsia="" w:cs="" w:asciiTheme="majorHAnsi" w:cstheme="majorBidi" w:eastAsiaTheme="majorEastAsia" w:hAnsiTheme="majorHAnsi"/>
       <w:spacing w:val="-10"/>
       <w:kern w:val="2"/>
       <w:sz w:val="56"/>
@@ -29839,17 +29825,17 @@
     <w:uiPriority w:val="11"/>
     <w:qFormat/>
     <w:rPr>
-      <w:rFonts w:eastAsia="等线 Light" w:cs="" w:cstheme="majorBidi" w:eastAsiaTheme="majorEastAsia"/>
-      <w:color w:themeColor="dark1" w:themeTint="fe" w:val="595959"/>
+      <w:rFonts w:eastAsia="" w:cs="" w:cstheme="majorBidi" w:eastAsiaTheme="majorEastAsia"/>
+      <w:color w:val="595959"/>
       <w:spacing w:val="15"/>
       <w:sz w:val="28"/>
       <w:szCs w:val="28"/>
       <w14:textFill>
         <w14:solidFill>
-          <w14:schemeClr w14:val="dark1">
+          <w14:srgbClr w14:val="595959">
+            <w14:lumOff w14:val="35000"/>
             <w14:lumMod w14:val="65000"/>
-            <w14:lumOff w14:val="35000"/>
-          </w14:schemeClr>
+          </w14:srgbClr>
         </w14:solidFill>
       </w14:textFill>
     </w:rPr>
@@ -29863,13 +29849,13 @@
     <w:rPr>
       <w:i/>
       <w:iCs/>
-      <w:color w:themeColor="dark1" w:themeTint="fe" w:val="404040"/>
+      <w:color w:val="404040"/>
       <w14:textFill>
         <w14:solidFill>
-          <w14:schemeClr w14:val="dark1">
+          <w14:srgbClr w14:val="404040">
+            <w14:lumOff w14:val="25000"/>
             <w14:lumMod w14:val="75000"/>
-            <w14:lumOff w14:val="25000"/>
-          </w14:schemeClr>
+          </w14:srgbClr>
         </w14:solidFill>
       </w14:textFill>
     </w:rPr>
@@ -30043,17 +30029,17 @@
       <w:spacing w:before="0" w:after="160"/>
     </w:pPr>
     <w:rPr>
-      <w:rFonts w:eastAsia="等线 Light" w:cs="" w:cstheme="majorBidi" w:eastAsiaTheme="majorEastAsia"/>
-      <w:color w:themeColor="dark1" w:themeTint="fe" w:val="595959"/>
+      <w:rFonts w:eastAsia="" w:cs="" w:cstheme="majorBidi" w:eastAsiaTheme="majorEastAsia"/>
+      <w:color w:val="595959"/>
       <w:spacing w:val="15"/>
       <w:sz w:val="28"/>
       <w:szCs w:val="28"/>
       <w14:textFill>
         <w14:solidFill>
-          <w14:schemeClr w14:val="dark1">
+          <w14:srgbClr w14:val="595959">
+            <w14:lumOff w14:val="35000"/>
             <w14:lumMod w14:val="65000"/>
-            <w14:lumOff w14:val="35000"/>
-          </w14:schemeClr>
+          </w14:srgbClr>
         </w14:solidFill>
       </w14:textFill>
     </w:rPr>
@@ -30070,7 +30056,7 @@
       <w:contextualSpacing/>
     </w:pPr>
     <w:rPr>
-      <w:rFonts w:ascii="Aptos Display" w:hAnsi="Aptos Display" w:eastAsia="等线 Light" w:cs="" w:asciiTheme="majorHAnsi" w:cstheme="majorBidi" w:eastAsiaTheme="majorEastAsia" w:hAnsiTheme="majorHAnsi"/>
+      <w:rFonts w:ascii="Aptos Display" w:hAnsi="Aptos Display" w:eastAsia="" w:cs="" w:asciiTheme="majorHAnsi" w:cstheme="majorBidi" w:eastAsiaTheme="majorEastAsia" w:hAnsiTheme="majorHAnsi"/>
       <w:spacing w:val="-10"/>
       <w:kern w:val="2"/>
       <w:sz w:val="56"/>
@@ -30091,13 +30077,13 @@
     <w:rPr>
       <w:i/>
       <w:iCs/>
-      <w:color w:themeColor="dark1" w:themeTint="fe" w:val="404040"/>
+      <w:color w:val="404040"/>
       <w14:textFill>
         <w14:solidFill>
-          <w14:schemeClr w14:val="dark1">
+          <w14:srgbClr w14:val="404040">
+            <w14:lumOff w14:val="25000"/>
             <w14:lumMod w14:val="75000"/>
-            <w14:lumOff w14:val="25000"/>
-          </w14:schemeClr>
+          </w14:srgbClr>
         </w14:solidFill>
       </w14:textFill>
     </w:rPr>
@@ -30175,37 +30161,37 @@
         <a:srgbClr val="000000"/>
       </a:dk1>
       <a:lt1>
-        <a:srgbClr val="ffffff"/>
+        <a:srgbClr val="FFFFFF"/>
       </a:lt1>
       <a:dk2>
-        <a:srgbClr val="0e2841"/>
+        <a:srgbClr val="0E2841"/>
       </a:dk2>
       <a:lt2>
-        <a:srgbClr val="e8e8e8"/>
+        <a:srgbClr val="E8E8E8"/>
       </a:lt2>
       <a:accent1>
         <a:srgbClr val="156082"/>
       </a:accent1>
       <a:accent2>
-        <a:srgbClr val="e97132"/>
+        <a:srgbClr val="E97132"/>
       </a:accent2>
       <a:accent3>
-        <a:srgbClr val="196b24"/>
+        <a:srgbClr val="196B24"/>
       </a:accent3>
       <a:accent4>
-        <a:srgbClr val="0f9ed5"/>
+        <a:srgbClr val="0F9ED5"/>
       </a:accent4>
       <a:accent5>
-        <a:srgbClr val="a02b93"/>
+        <a:srgbClr val="A02B93"/>
       </a:accent5>
       <a:accent6>
-        <a:srgbClr val="4ea72e"/>
+        <a:srgbClr val="4EA72E"/>
       </a:accent6>
       <a:hlink>
         <a:srgbClr val="467886"/>
       </a:hlink>
       <a:folHlink>
-        <a:srgbClr val="96607d"/>
+        <a:srgbClr val="96607D"/>
       </a:folHlink>
     </a:clrScheme>
     <a:fontScheme name="Office">

</xml_diff>